<commit_message>
Update Word document report with explicit faculty headings
</commit_message>
<xml_diff>
--- a/05_Documentation/Financial_Analytics_Project_Report.docx
+++ b/05_Documentation/Financial_Analytics_Project_Report.docx
@@ -32,6 +32,167 @@
         <w:t>Faculty Academic Project Report — Financial Data Analytics</w:t>
       </w:r>
     </w:p>
+    <w:tbl>
+      <w:tblPr>
+        <w:tblW w:type="auto" w:w="0"/>
+        <w:jc w:val="center"/>
+        <w:tblLook w:firstColumn="1" w:firstRow="1" w:lastColumn="0" w:lastRow="0" w:noHBand="0" w:noVBand="1" w:val="04A0"/>
+      </w:tblPr>
+      <w:tblGrid>
+        <w:gridCol w:w="4680"/>
+        <w:gridCol w:w="4680"/>
+      </w:tblGrid>
+      <w:tr>
+        <w:tc>
+          <w:tcPr>
+            <w:tcW w:type="dxa" w:w="4680"/>
+          </w:tcPr>
+          <w:p>
+            <w:r>
+              <w:rPr>
+                <w:b/>
+                <w:sz w:val="20"/>
+              </w:rPr>
+              <w:t>Project Name:</w:t>
+            </w:r>
+          </w:p>
+        </w:tc>
+        <w:tc>
+          <w:tcPr>
+            <w:tcW w:type="dxa" w:w="4680"/>
+          </w:tcPr>
+          <w:p>
+            <w:r>
+              <w:rPr>
+                <w:sz w:val="20"/>
+              </w:rPr>
+              <w:t>Financial Transaction &amp; Customer Analytics System</w:t>
+            </w:r>
+          </w:p>
+        </w:tc>
+      </w:tr>
+      <w:tr>
+        <w:tc>
+          <w:tcPr>
+            <w:tcW w:type="dxa" w:w="4680"/>
+          </w:tcPr>
+          <w:p>
+            <w:r>
+              <w:rPr>
+                <w:b/>
+                <w:sz w:val="20"/>
+              </w:rPr>
+              <w:t>Domain:</w:t>
+            </w:r>
+          </w:p>
+        </w:tc>
+        <w:tc>
+          <w:tcPr>
+            <w:tcW w:type="dxa" w:w="4680"/>
+          </w:tcPr>
+          <w:p>
+            <w:r>
+              <w:rPr>
+                <w:sz w:val="20"/>
+              </w:rPr>
+              <w:t>Financial Data Analytics</w:t>
+            </w:r>
+          </w:p>
+        </w:tc>
+      </w:tr>
+      <w:tr>
+        <w:tc>
+          <w:tcPr>
+            <w:tcW w:type="dxa" w:w="4680"/>
+          </w:tcPr>
+          <w:p>
+            <w:r>
+              <w:rPr>
+                <w:b/>
+                <w:sz w:val="20"/>
+              </w:rPr>
+              <w:t>Storage Engine:</w:t>
+            </w:r>
+          </w:p>
+        </w:tc>
+        <w:tc>
+          <w:tcPr>
+            <w:tcW w:type="dxa" w:w="4680"/>
+          </w:tcPr>
+          <w:p>
+            <w:r>
+              <w:rPr>
+                <w:sz w:val="20"/>
+              </w:rPr>
+              <w:t>Microsoft SQL Server Database (FinancialAnalyticsDB)</w:t>
+            </w:r>
+          </w:p>
+        </w:tc>
+      </w:tr>
+      <w:tr>
+        <w:tc>
+          <w:tcPr>
+            <w:tcW w:type="dxa" w:w="4680"/>
+          </w:tcPr>
+          <w:p>
+            <w:r>
+              <w:rPr>
+                <w:b/>
+                <w:sz w:val="20"/>
+              </w:rPr>
+              <w:t>Primary Visualization Tool:</w:t>
+            </w:r>
+          </w:p>
+        </w:tc>
+        <w:tc>
+          <w:tcPr>
+            <w:tcW w:type="dxa" w:w="4680"/>
+          </w:tcPr>
+          <w:p>
+            <w:r>
+              <w:rPr>
+                <w:sz w:val="20"/>
+              </w:rPr>
+              <w:t>Power BI (5 Interactive Dashboard Pages)</w:t>
+            </w:r>
+          </w:p>
+        </w:tc>
+      </w:tr>
+      <w:tr>
+        <w:tc>
+          <w:tcPr>
+            <w:tcW w:type="dxa" w:w="4680"/>
+          </w:tcPr>
+          <w:p>
+            <w:r>
+              <w:rPr>
+                <w:b/>
+                <w:sz w:val="20"/>
+              </w:rPr>
+              <w:t>Verified Dataset:</w:t>
+            </w:r>
+          </w:p>
+        </w:tc>
+        <w:tc>
+          <w:tcPr>
+            <w:tcW w:type="dxa" w:w="4680"/>
+          </w:tcPr>
+          <w:p>
+            <w:r>
+              <w:rPr>
+                <w:sz w:val="20"/>
+              </w:rPr>
+              <w:t>Kaggle Financial Transactions (25,000 Records Managed in SQL)</w:t>
+            </w:r>
+          </w:p>
+        </w:tc>
+      </w:tr>
+    </w:tbl>
+    <w:p>
+      <w:pPr>
+        <w:spacing w:after="200"/>
+      </w:pPr>
+    </w:p>
     <w:p>
       <w:pPr>
         <w:spacing w:before="320" w:after="120"/>
@@ -43,7 +204,7 @@
           <w:color w:val="1E3A8A"/>
           <w:sz w:val="30"/>
         </w:rPr>
-        <w:t>1. Project Overview</w:t>
+        <w:t>1. Aim</w:t>
       </w:r>
     </w:p>
     <w:p>
@@ -55,43 +216,7 @@
           <w:rFonts w:ascii="Calibri" w:hAnsi="Calibri"/>
           <w:sz w:val="22"/>
         </w:rPr>
-        <w:t>Project Title: Financial Transaction &amp; Customer Analytics System</w:t>
-      </w:r>
-    </w:p>
-    <w:p>
-      <w:pPr>
-        <w:spacing w:after="120" w:line="276" w:lineRule="auto"/>
-      </w:pPr>
-      <w:r>
-        <w:rPr>
-          <w:rFonts w:ascii="Calibri" w:hAnsi="Calibri"/>
-          <w:sz w:val="22"/>
-        </w:rPr>
-        <w:t>Domain: Financial Data Analytics | Database: Microsoft SQL Server (FinancialAnalyticsDB) | Programming: Python | Primary Visualization: Microsoft Power BI | Supplementary Visualization: Tableau | Dataset Size: 25,000 transaction records.</w:t>
-      </w:r>
-    </w:p>
-    <w:p>
-      <w:pPr>
-        <w:spacing w:after="120" w:line="276" w:lineRule="auto"/>
-      </w:pPr>
-      <w:r>
-        <w:rPr>
-          <w:rFonts w:ascii="Calibri" w:hAnsi="Calibri"/>
-          <w:sz w:val="22"/>
-        </w:rPr>
-        <w:t>This project is an end-to-end financial data analytics system that analyzes transaction activity, customer spending, transaction categories, payment channels, geographical patterns, and fraud/risk indicators.</w:t>
-      </w:r>
-    </w:p>
-    <w:p>
-      <w:pPr>
-        <w:spacing w:after="120" w:line="276" w:lineRule="auto"/>
-      </w:pPr>
-      <w:r>
-        <w:rPr>
-          <w:rFonts w:ascii="Calibri" w:hAnsi="Calibri"/>
-          <w:sz w:val="22"/>
-        </w:rPr>
-        <w:t>Workflow: Kaggle Dataset ↓ Python Data Cleaning &amp; Transformation ↓ Microsoft SQL Server ↓ T-SQL Queries &amp; Analytical Views ↓ Power BI / Tableau ↓ Business Insights &amp; Results.</w:t>
+        <w:t>To design and build an independent, enterprise-grade Financial Transaction &amp; Customer Analytics System utilizing Python, MS SQL Server, and Power BI to analyze 25,000 financial records across customer spending behaviors, transaction categories, payment channels, geographic distributions, and risk anomalies.</w:t>
       </w:r>
     </w:p>
     <w:p>
@@ -105,7 +230,7 @@
           <w:color w:val="1E3A8A"/>
           <w:sz w:val="30"/>
         </w:rPr>
-        <w:t>2. Dataset Details</w:t>
+        <w:t>2. Algorithm</w:t>
       </w:r>
     </w:p>
     <w:p>
@@ -117,31 +242,7 @@
           <w:rFonts w:ascii="Calibri" w:hAnsi="Calibri"/>
           <w:sz w:val="22"/>
         </w:rPr>
-        <w:t>Kaggle Dataset: Sparkov Financial Fraud Detection Dataset (kartik2112/fraud-detection)</w:t>
-      </w:r>
-    </w:p>
-    <w:p>
-      <w:pPr>
-        <w:spacing w:after="120" w:line="276" w:lineRule="auto"/>
-      </w:pPr>
-      <w:r>
-        <w:rPr>
-          <w:rFonts w:ascii="Calibri" w:hAnsi="Calibri"/>
-          <w:sz w:val="22"/>
-        </w:rPr>
-        <w:t>Source: Kaggle (https://www.kaggle.com/datasets/kartik2112/fraud-detection)</w:t>
-      </w:r>
-    </w:p>
-    <w:p>
-      <w:pPr>
-        <w:spacing w:after="120" w:line="276" w:lineRule="auto"/>
-      </w:pPr>
-      <w:r>
-        <w:rPr>
-          <w:rFonts w:ascii="Calibri" w:hAnsi="Calibri"/>
-          <w:sz w:val="22"/>
-        </w:rPr>
-        <w:t>From the original Kaggle dataset, 25,000 transaction records were selected and processed for this mini project.</w:t>
+        <w:t>The system operates on an automated 6-step Data Engineering &amp; Analytics Algorithm:</w:t>
       </w:r>
     </w:p>
     <w:p>
@@ -154,19 +255,72 @@
           <w:rFonts w:ascii="Calibri" w:hAnsi="Calibri"/>
           <w:sz w:val="22"/>
         </w:rPr>
-        <w:t>Important Attributes: Transaction number, Transaction date &amp; time, Card/Customer info, Customer Name, Gender, Date of Birth, Job, City, State, ZIP Code, Latitude &amp; Longitude, Merchant, Transaction Category, Amount, Fraud Indicator.</w:t>
+        <w:t>Step 1 (Ingestion &amp; Cleaning): Ingest raw Kaggle financial dataset in memory via Python; clean null values, standardize data types, calculate customer age groups, and assign payment channels.</w:t>
       </w:r>
     </w:p>
     <w:p>
       <w:pPr>
-        <w:spacing w:after="120" w:line="276" w:lineRule="auto"/>
+        <w:pStyle w:val="ListBullet"/>
+        <w:spacing w:after="80"/>
       </w:pPr>
       <w:r>
         <w:rPr>
           <w:rFonts w:ascii="Calibri" w:hAnsi="Calibri"/>
           <w:sz w:val="22"/>
         </w:rPr>
-        <w:t>Important Note: The original Kaggle dataset is used only as the source dataset for Python ingestion and preprocessing. The project database is Microsoft SQL Server. The submitted analytical workflow retrieves and analyzes data from SQL Server rather than depending on a CSV file.</w:t>
+        <w:t>Step 2 (SQL Server Star Schema Modeling): Separate clean attributes into normalized dimension tables (DimCustomers, DimCategories, DimPaymentMethods, DimLocations, DimDates) and a central FactTransactions table.</w:t>
+      </w:r>
+    </w:p>
+    <w:p>
+      <w:pPr>
+        <w:pStyle w:val="ListBullet"/>
+        <w:spacing w:after="80"/>
+      </w:pPr>
+      <w:r>
+        <w:rPr>
+          <w:rFonts w:ascii="Calibri" w:hAnsi="Calibri"/>
+          <w:sz w:val="22"/>
+        </w:rPr>
+        <w:t>Step 3 (SQL Server Data Ingestion): Load dimensional and fact tables directly into SQL Server database FinancialAnalyticsDB; establish primary keys, foreign keys, and non-clustered indexes.</w:t>
+      </w:r>
+    </w:p>
+    <w:p>
+      <w:pPr>
+        <w:pStyle w:val="ListBullet"/>
+        <w:spacing w:after="80"/>
+      </w:pPr>
+      <w:r>
+        <w:rPr>
+          <w:rFonts w:ascii="Calibri" w:hAnsi="Calibri"/>
+          <w:sz w:val="22"/>
+        </w:rPr>
+        <w:t>Step 4 (T-SQL Business Analytics): Execute 15 T-SQL business queries utilizing CTEs, window functions (DENSE_RANK, NTILE, Z-Score), and analytical views.</w:t>
+      </w:r>
+    </w:p>
+    <w:p>
+      <w:pPr>
+        <w:pStyle w:val="ListBullet"/>
+        <w:spacing w:after="80"/>
+      </w:pPr>
+      <w:r>
+        <w:rPr>
+          <w:rFonts w:ascii="Calibri" w:hAnsi="Calibri"/>
+          <w:sz w:val="22"/>
+        </w:rPr>
+        <w:t>Step 5 (Power BI Dashboard Visualization): Connect Power BI directly to SQL Server database engine to render a 5-page interactive report, DAX KPIs, and dynamic category/geographic slicers.</w:t>
+      </w:r>
+    </w:p>
+    <w:p>
+      <w:pPr>
+        <w:pStyle w:val="ListBullet"/>
+        <w:spacing w:after="80"/>
+      </w:pPr>
+      <w:r>
+        <w:rPr>
+          <w:rFonts w:ascii="Calibri" w:hAnsi="Calibri"/>
+          <w:sz w:val="22"/>
+        </w:rPr>
+        <w:t>Step 6 (Results Output &amp; QR Code Generation): Export analytical findings into results summary log, compile Word project report, and generate an independent Project 1 QR code.</w:t>
       </w:r>
     </w:p>
     <w:p>
@@ -180,7 +334,55 @@
           <w:color w:val="1E3A8A"/>
           <w:sz w:val="30"/>
         </w:rPr>
-        <w:t>3. Technologies Used</w:t>
+        <w:t>3. Methodology</w:t>
+      </w:r>
+    </w:p>
+    <w:p>
+      <w:pPr>
+        <w:spacing w:after="120" w:line="276" w:lineRule="auto"/>
+      </w:pPr>
+      <w:r>
+        <w:rPr>
+          <w:rFonts w:ascii="Calibri" w:hAnsi="Calibri"/>
+          <w:sz w:val="22"/>
+        </w:rPr>
+        <w:t>The project methodology follows strict academic data processing standards:</w:t>
+      </w:r>
+    </w:p>
+    <w:p>
+      <w:pPr>
+        <w:spacing w:after="120" w:line="276" w:lineRule="auto"/>
+      </w:pPr>
+      <w:r>
+        <w:rPr>
+          <w:rFonts w:ascii="Calibri" w:hAnsi="Calibri"/>
+          <w:sz w:val="22"/>
+        </w:rPr>
+        <w:t>Official Project Architecture Flow:</w:t>
+      </w:r>
+    </w:p>
+    <w:p>
+      <w:pPr>
+        <w:spacing w:after="120" w:line="276" w:lineRule="auto"/>
+      </w:pPr>
+      <w:r>
+        <w:rPr>
+          <w:rFonts w:ascii="Calibri" w:hAnsi="Calibri"/>
+          <w:sz w:val="22"/>
+        </w:rPr>
+        <w:t>Kaggle Dataset → Python (Cleaning + Transformation) → Microsoft SQL Server (FinancialAnalyticsDB) → T-SQL (Queries + Views + Analysis) → Power BI (5 Interactive Dashboard Pages) → Results + Observations → Word Project Manual → Project 1 QR Code</w:t>
+      </w:r>
+    </w:p>
+    <w:p>
+      <w:pPr>
+        <w:spacing w:after="120" w:line="276" w:lineRule="auto"/>
+      </w:pPr>
+      <w:r>
+        <w:rPr>
+          <w:rFonts w:ascii="Calibri" w:hAnsi="Calibri"/>
+          <w:sz w:val="22"/>
+        </w:rPr>
+        <w:t>Data Storage Protocol: The Kaggle CSV was used only as the original source for Python ingestion. After preprocessing, the records were loaded into Microsoft SQL Server. The submitted analytical workflow retrieves data from SQL Server, not from CSV.</w:t>
       </w:r>
     </w:p>
     <w:p>
@@ -193,7 +395,7 @@
           <w:rFonts w:ascii="Calibri" w:hAnsi="Calibri"/>
           <w:sz w:val="22"/>
         </w:rPr>
-        <w:t>Python: Data cleaning, transformation, ETL and analysis</w:t>
+        <w:t>Primary Visualization Engine: Power BI serves as the primary dashboard platform, delivering 5 interactive report pages (Executive Overview, Customer Analytics, Category &amp; Payment Analytics, Geographical Analytics, Risk &amp; Anomaly Analytics).</w:t>
       </w:r>
     </w:p>
     <w:p>
@@ -206,72 +408,7 @@
           <w:rFonts w:ascii="Calibri" w:hAnsi="Calibri"/>
           <w:sz w:val="22"/>
         </w:rPr>
-        <w:t>Pandas &amp; NumPy: Data processing and matrix transformations</w:t>
-      </w:r>
-    </w:p>
-    <w:p>
-      <w:pPr>
-        <w:pStyle w:val="ListBullet"/>
-        <w:spacing w:after="80"/>
-      </w:pPr>
-      <w:r>
-        <w:rPr>
-          <w:rFonts w:ascii="Calibri" w:hAnsi="Calibri"/>
-          <w:sz w:val="22"/>
-        </w:rPr>
-        <w:t>Microsoft SQL Server: Primary data storage and management (FinancialAnalyticsDB)</w:t>
-      </w:r>
-    </w:p>
-    <w:p>
-      <w:pPr>
-        <w:pStyle w:val="ListBullet"/>
-        <w:spacing w:after="80"/>
-      </w:pPr>
-      <w:r>
-        <w:rPr>
-          <w:rFonts w:ascii="Calibri" w:hAnsi="Calibri"/>
-          <w:sz w:val="22"/>
-        </w:rPr>
-        <w:t>T-SQL: Database operations, queries and analytical views</w:t>
-      </w:r>
-    </w:p>
-    <w:p>
-      <w:pPr>
-        <w:pStyle w:val="ListBullet"/>
-        <w:spacing w:after="80"/>
-      </w:pPr>
-      <w:r>
-        <w:rPr>
-          <w:rFonts w:ascii="Calibri" w:hAnsi="Calibri"/>
-          <w:sz w:val="22"/>
-        </w:rPr>
-        <w:t>Power BI Desktop: Primary interactive visualization (5 pages)</w:t>
-      </w:r>
-    </w:p>
-    <w:p>
-      <w:pPr>
-        <w:pStyle w:val="ListBullet"/>
-        <w:spacing w:after="80"/>
-      </w:pPr>
-      <w:r>
-        <w:rPr>
-          <w:rFonts w:ascii="Calibri" w:hAnsi="Calibri"/>
-          <w:sz w:val="22"/>
-        </w:rPr>
-        <w:t>Tableau Desktop: Supplementary visualization asset</w:t>
-      </w:r>
-    </w:p>
-    <w:p>
-      <w:pPr>
-        <w:pStyle w:val="ListBullet"/>
-        <w:spacing w:after="80"/>
-      </w:pPr>
-      <w:r>
-        <w:rPr>
-          <w:rFonts w:ascii="Calibri" w:hAnsi="Calibri"/>
-          <w:sz w:val="22"/>
-        </w:rPr>
-        <w:t>Jupyter Notebook: Interactive analysis and demonstration</w:t>
+        <w:t>Supplementary Implementation Asset: Tableau workbook Financial_Analytics.twbx is included as a secondary visualization asset demonstrating calculated fields and filter actions.</w:t>
       </w:r>
     </w:p>
     <w:p>
@@ -285,7 +422,7 @@
           <w:color w:val="1E3A8A"/>
           <w:sz w:val="30"/>
         </w:rPr>
-        <w:t>4. Microsoft SQL Server Database</w:t>
+        <w:t>4. Dataset Details</w:t>
       </w:r>
     </w:p>
     <w:p>
@@ -297,19 +434,7 @@
           <w:rFonts w:ascii="Calibri" w:hAnsi="Calibri"/>
           <w:sz w:val="22"/>
         </w:rPr>
-        <w:t>Database Name: FinancialAnalyticsDB (Relational Star-Schema Architecture)</w:t>
-      </w:r>
-    </w:p>
-    <w:p>
-      <w:pPr>
-        <w:spacing w:after="120" w:line="276" w:lineRule="auto"/>
-      </w:pPr>
-      <w:r>
-        <w:rPr>
-          <w:rFonts w:ascii="Calibri" w:hAnsi="Calibri"/>
-          <w:sz w:val="22"/>
-        </w:rPr>
-        <w:t>Main Tables: DimCustomers, DimCategories, DimPaymentMethods, DimLocations, DimDates, FactTransactions</w:t>
+        <w:t>The system relies on a verified, high-volume financial transaction dataset:</w:t>
       </w:r>
     </w:p>
     <w:p>
@@ -322,7 +447,7 @@
           <w:rFonts w:ascii="Calibri" w:hAnsi="Calibri"/>
           <w:sz w:val="22"/>
         </w:rPr>
-        <w:t>FactTransactions: Contains core transaction records (TransactionID, DateKey, CustomerID, CategoryID, PaymentMethodID, LocationID, MerchantName, TransactionAmount, IsFraud, RiskCategory).</w:t>
+        <w:t>Source: Kaggle kartik2112/fraud-detection (Sparkov Financial Transactions Dataset).</w:t>
       </w:r>
     </w:p>
     <w:p>
@@ -335,7 +460,7 @@
           <w:rFonts w:ascii="Calibri" w:hAnsi="Calibri"/>
           <w:sz w:val="22"/>
         </w:rPr>
-        <w:t>DimCustomers: Customer demographic and profile information.</w:t>
+        <w:t>Kaggle Link: https://www.kaggle.com/datasets/kartik2112/fraud-detection</w:t>
       </w:r>
     </w:p>
     <w:p>
@@ -348,7 +473,7 @@
           <w:rFonts w:ascii="Calibri" w:hAnsi="Calibri"/>
           <w:sz w:val="22"/>
         </w:rPr>
-        <w:t>DimCategories: Transaction categories and super-categories.</w:t>
+        <w:t>Total Records Managed in SQL: 25,000 transaction records (exceeding the ~20,000 faculty requirement).</w:t>
       </w:r>
     </w:p>
     <w:p>
@@ -361,7 +486,7 @@
           <w:rFonts w:ascii="Calibri" w:hAnsi="Calibri"/>
           <w:sz w:val="22"/>
         </w:rPr>
-        <w:t>DimPaymentMethods: Payment channels and classifications.</w:t>
+        <w:t>Data Integrity Audit: 0 null or missing values; 100% foreign key integrity across all 5 dimension tables.</w:t>
       </w:r>
     </w:p>
     <w:p>
@@ -374,7 +499,7 @@
           <w:rFonts w:ascii="Calibri" w:hAnsi="Calibri"/>
           <w:sz w:val="22"/>
         </w:rPr>
-        <w:t>DimLocations: City, State, ZIP code, coordinates, and region.</w:t>
+        <w:t>Primary Dimensions &amp; Features:</w:t>
       </w:r>
     </w:p>
     <w:p>
@@ -387,7 +512,72 @@
           <w:rFonts w:ascii="Calibri" w:hAnsi="Calibri"/>
           <w:sz w:val="22"/>
         </w:rPr>
-        <w:t>DimDates: Calendar attributes used for time-series analysis.</w:t>
+        <w:t xml:space="preserve">  - Customer Attributes: Customer ID, Card Number, Full Name, Gender, Date of Birth, Age (15 to 88), Age Group (&lt;25 to 65+), Job Title.</w:t>
+      </w:r>
+    </w:p>
+    <w:p>
+      <w:pPr>
+        <w:pStyle w:val="ListBullet"/>
+        <w:spacing w:after="80"/>
+      </w:pPr>
+      <w:r>
+        <w:rPr>
+          <w:rFonts w:ascii="Calibri" w:hAnsi="Calibri"/>
+          <w:sz w:val="22"/>
+        </w:rPr>
+        <w:t xml:space="preserve">  - Transaction Attributes: Transaction Reference, Timestamp, Transaction Amount ($1.00 to $6,600.44), Merchant Name, Unix Time.</w:t>
+      </w:r>
+    </w:p>
+    <w:p>
+      <w:pPr>
+        <w:pStyle w:val="ListBullet"/>
+        <w:spacing w:after="80"/>
+      </w:pPr>
+      <w:r>
+        <w:rPr>
+          <w:rFonts w:ascii="Calibri" w:hAnsi="Calibri"/>
+          <w:sz w:val="22"/>
+        </w:rPr>
+        <w:t xml:space="preserve">  - Spending Categories: 14 distinct categories (grocery_pos, shopping_net, gas_transport, entertainment, travel, food_dining, etc.).</w:t>
+      </w:r>
+    </w:p>
+    <w:p>
+      <w:pPr>
+        <w:pStyle w:val="ListBullet"/>
+        <w:spacing w:after="80"/>
+      </w:pPr>
+      <w:r>
+        <w:rPr>
+          <w:rFonts w:ascii="Calibri" w:hAnsi="Calibri"/>
+          <w:sz w:val="22"/>
+        </w:rPr>
+        <w:t xml:space="preserve">  - Payment Channels: 5 distinct channels (Credit Card, Debit Card, UPI / Bank Transfer, Mobile Wallet, Contactless POS).</w:t>
+      </w:r>
+    </w:p>
+    <w:p>
+      <w:pPr>
+        <w:pStyle w:val="ListBullet"/>
+        <w:spacing w:after="80"/>
+      </w:pPr>
+      <w:r>
+        <w:rPr>
+          <w:rFonts w:ascii="Calibri" w:hAnsi="Calibri"/>
+          <w:sz w:val="22"/>
+        </w:rPr>
+        <w:t xml:space="preserve">  - Geographic Attributes: Street, City, State (50 US States represented), Zip Code, Lat/Long, Region (South, Midwest, Northeast, West).</w:t>
+      </w:r>
+    </w:p>
+    <w:p>
+      <w:pPr>
+        <w:pStyle w:val="ListBullet"/>
+        <w:spacing w:after="80"/>
+      </w:pPr>
+      <w:r>
+        <w:rPr>
+          <w:rFonts w:ascii="Calibri" w:hAnsi="Calibri"/>
+          <w:sz w:val="22"/>
+        </w:rPr>
+        <w:t xml:space="preserve">  - Risk Indicators: Fraud Flag (0/1), Risk Category (Normal, High-Value Transaction, Suspicious High-Value, Flagged Fraud).</w:t>
       </w:r>
     </w:p>
     <w:p>
@@ -401,7 +591,7 @@
           <w:color w:val="1E3A8A"/>
           <w:sz w:val="30"/>
         </w:rPr>
-        <w:t>5. SQL Server Files</w:t>
+        <w:t>5. Results</w:t>
       </w:r>
     </w:p>
     <w:p>
@@ -413,7 +603,7 @@
           <w:rFonts w:ascii="Calibri" w:hAnsi="Calibri"/>
           <w:sz w:val="22"/>
         </w:rPr>
-        <w:t>All SQL scripts are stored in 01_Database/:</w:t>
+        <w:t>Execution of T-SQL queries and Python analytics routines produced key financial results:</w:t>
       </w:r>
     </w:p>
     <w:p>
@@ -426,7 +616,7 @@
           <w:rFonts w:ascii="Calibri" w:hAnsi="Calibri"/>
           <w:sz w:val="22"/>
         </w:rPr>
-        <w:t>01_FinancialDB_Create.sql: Database creation and settings.</w:t>
+        <w:t>Total Transactions Processed: 25,000</w:t>
       </w:r>
     </w:p>
     <w:p>
@@ -439,7 +629,7 @@
           <w:rFonts w:ascii="Calibri" w:hAnsi="Calibri"/>
           <w:sz w:val="22"/>
         </w:rPr>
-        <w:t>02_FinancialDB_Tables.sql: Tables DDL, primary/foreign keys, unique constraints, non-clustered indexes.</w:t>
+        <w:t>Total Transaction Revenue: $1,724,423.32</w:t>
       </w:r>
     </w:p>
     <w:p>
@@ -452,7 +642,7 @@
           <w:rFonts w:ascii="Calibri" w:hAnsi="Calibri"/>
           <w:sz w:val="22"/>
         </w:rPr>
-        <w:t>03_FinancialDB_Insert.sql: SQL data insertion and audit.</w:t>
+        <w:t>Average Transaction Value (ATV): $68.98</w:t>
       </w:r>
     </w:p>
     <w:p>
@@ -465,7 +655,7 @@
           <w:rFonts w:ascii="Calibri" w:hAnsi="Calibri"/>
           <w:sz w:val="22"/>
         </w:rPr>
-        <w:t>04_FinancialDB_Views.sql: Analytical SQL views (vw_ExecutiveOverview, vw_CustomerAnalytics, vw_CategoryPerformance, etc.).</w:t>
+        <w:t>Active Unique Customers: 909 distinct customer accounts</w:t>
       </w:r>
     </w:p>
     <w:p>
@@ -478,7 +668,59 @@
           <w:rFonts w:ascii="Calibri" w:hAnsi="Calibri"/>
           <w:sz w:val="22"/>
         </w:rPr>
-        <w:t>05_FinancialDB_Queries.sql: 15 advanced T-SQL queries.</w:t>
+        <w:t>Fraud Anomaly Count: 83 confirmed fraud cases causing $47,788.71 in exposure (0.33% transaction fraud rate)</w:t>
+      </w:r>
+    </w:p>
+    <w:p>
+      <w:pPr>
+        <w:pStyle w:val="ListBullet"/>
+        <w:spacing w:after="80"/>
+      </w:pPr>
+      <w:r>
+        <w:rPr>
+          <w:rFonts w:ascii="Calibri" w:hAnsi="Calibri"/>
+          <w:sz w:val="22"/>
+        </w:rPr>
+        <w:t>Top Spending Category: Grocery POS generated $262,548.26 in total revenue (15.23% revenue share)</w:t>
+      </w:r>
+    </w:p>
+    <w:p>
+      <w:pPr>
+        <w:pStyle w:val="ListBullet"/>
+        <w:spacing w:after="80"/>
+      </w:pPr>
+      <w:r>
+        <w:rPr>
+          <w:rFonts w:ascii="Calibri" w:hAnsi="Calibri"/>
+          <w:sz w:val="22"/>
+        </w:rPr>
+        <w:t>Top Payment Method: Mobile Wallet generated $352,059.98 across 5,106 transactions</w:t>
+      </w:r>
+    </w:p>
+    <w:p>
+      <w:pPr>
+        <w:pStyle w:val="ListBullet"/>
+        <w:spacing w:after="80"/>
+      </w:pPr>
+      <w:r>
+        <w:rPr>
+          <w:rFonts w:ascii="Calibri" w:hAnsi="Calibri"/>
+          <w:sz w:val="22"/>
+        </w:rPr>
+        <w:t>Top US State by Revenue: Texas (TX) with $125,130.60 across 1,860 transactions, followed by New York ($117,125.98) and Pennsylvania ($104,915.81)</w:t>
+      </w:r>
+    </w:p>
+    <w:p>
+      <w:pPr>
+        <w:pStyle w:val="ListBullet"/>
+        <w:spacing w:after="80"/>
+      </w:pPr>
+      <w:r>
+        <w:rPr>
+          <w:rFonts w:ascii="Calibri" w:hAnsi="Calibri"/>
+          <w:sz w:val="22"/>
+        </w:rPr>
+        <w:t>High-Value Customer Leaderboard: Stacy Lambert (#1 rank, $8,229.99 lifetime spend), Alyssa Morgan (#2 rank, $8,037.16), William Perry (#3 rank, $8,020.26)</w:t>
       </w:r>
     </w:p>
     <w:p>
@@ -492,7 +734,7 @@
           <w:color w:val="1E3A8A"/>
           <w:sz w:val="30"/>
         </w:rPr>
-        <w:t>6. Faculty SQL Interaction Guide</w:t>
+        <w:t>6. Observations</w:t>
       </w:r>
     </w:p>
     <w:p>
@@ -504,19 +746,72 @@
           <w:rFonts w:ascii="Calibri" w:hAnsi="Calibri"/>
           <w:sz w:val="22"/>
         </w:rPr>
-        <w:t>Execute scripts in order: 01_FinancialDB_Create.sql → 02_FinancialDB_Tables.sql → 03_FinancialDB_Insert.sql → 04_FinancialDB_Views.sql → 05_FinancialDB_Queries.sql</w:t>
+        <w:t>Key business observations derived from analytical dashboards and T-SQL query execution:</w:t>
       </w:r>
     </w:p>
     <w:p>
       <w:pPr>
-        <w:spacing w:after="120" w:line="276" w:lineRule="auto"/>
+        <w:pStyle w:val="ListBullet"/>
+        <w:spacing w:after="80"/>
       </w:pPr>
       <w:r>
         <w:rPr>
           <w:rFonts w:ascii="Calibri" w:hAnsi="Calibri"/>
           <w:sz w:val="22"/>
         </w:rPr>
-        <w:t>Verification Query: USE FinancialAnalyticsDB; SELECT COUNT(*) AS TotalTransactions FROM FactTransactions; -- Expected: 25,000</w:t>
+        <w:t>Demographic Concentration: Customers aged 35–49 represent the highest revenue generating demographic ($634,549.22 combined spend), spending 2.4x more than customers under 25.</w:t>
+      </w:r>
+    </w:p>
+    <w:p>
+      <w:pPr>
+        <w:pStyle w:val="ListBullet"/>
+        <w:spacing w:after="80"/>
+      </w:pPr>
+      <w:r>
+        <w:rPr>
+          <w:rFonts w:ascii="Calibri" w:hAnsi="Calibri"/>
+          <w:sz w:val="22"/>
+        </w:rPr>
+        <w:t>Category Velocity vs Ticket Size: Grocery POS transactions exhibit high volume and high average ticket size ($114.70), whereas Food &amp; Dining transactions exhibit high frequency but lower ticket size ($50.78).</w:t>
+      </w:r>
+    </w:p>
+    <w:p>
+      <w:pPr>
+        <w:pStyle w:val="ListBullet"/>
+        <w:spacing w:after="80"/>
+      </w:pPr>
+      <w:r>
+        <w:rPr>
+          <w:rFonts w:ascii="Calibri" w:hAnsi="Calibri"/>
+          <w:sz w:val="22"/>
+        </w:rPr>
+        <w:t>Payment Channel Preference: Digital payment channels (Mobile Wallet and UPI/Bank Transfer) account for 40.3% of total revenue ($694,818.65), showing equal adoption to traditional card/POS channels.</w:t>
+      </w:r>
+    </w:p>
+    <w:p>
+      <w:pPr>
+        <w:pStyle w:val="ListBullet"/>
+        <w:spacing w:after="80"/>
+      </w:pPr>
+      <w:r>
+        <w:rPr>
+          <w:rFonts w:ascii="Calibri" w:hAnsi="Calibri"/>
+          <w:sz w:val="22"/>
+        </w:rPr>
+        <w:t>Regional Market Distribution: The Southern US region accounts for 38.0% of total revenue ($654,924.93), followed by Midwest ($483,000.08), Northeast ($344,978.40), and West ($237,191.38).</w:t>
+      </w:r>
+    </w:p>
+    <w:p>
+      <w:pPr>
+        <w:pStyle w:val="ListBullet"/>
+        <w:spacing w:after="80"/>
+      </w:pPr>
+      <w:r>
+        <w:rPr>
+          <w:rFonts w:ascii="Calibri" w:hAnsi="Calibri"/>
+          <w:sz w:val="22"/>
+        </w:rPr>
+        <w:t>Fraud Anomaly Insights: Fraud transactions are heavily concentrated in online retail categories (shopping_net, misc_net) and high-value online transactions (&gt; $500), underscoring the need for automated real-time transaction scoring.</w:t>
       </w:r>
     </w:p>
     <w:p>
@@ -530,7 +825,7 @@
           <w:color w:val="1E3A8A"/>
           <w:sz w:val="30"/>
         </w:rPr>
-        <w:t>7. Power BI Dashboard (Primary Tool)</w:t>
+        <w:t>7. Database Architecture &amp; SQL Server Implementation</w:t>
       </w:r>
     </w:p>
     <w:p>
@@ -542,72 +837,31 @@
           <w:rFonts w:ascii="Calibri" w:hAnsi="Calibri"/>
           <w:sz w:val="22"/>
         </w:rPr>
-        <w:t>Power BI Report: 03_PowerBI/Financial_Analytics.pbix | DAX Measures: 03_PowerBI/dax_measures.dax</w:t>
+        <w:t>Database Name: FinancialAnalyticsDB (Microsoft SQL Server)</w:t>
       </w:r>
     </w:p>
     <w:p>
       <w:pPr>
-        <w:pStyle w:val="ListBullet"/>
-        <w:spacing w:after="80"/>
+        <w:spacing w:after="120" w:line="276" w:lineRule="auto"/>
       </w:pPr>
       <w:r>
         <w:rPr>
           <w:rFonts w:ascii="Calibri" w:hAnsi="Calibri"/>
           <w:sz w:val="22"/>
         </w:rPr>
-        <w:t>Page 1 — Executive Financial Overview: Revenue, Volume, Avg Value, Active Customers, Monthly Trend, Top Categories.</w:t>
+        <w:t>Relational Star Schema: FactTransactions linked via foreign keys to DimCustomers, DimCategories, DimPaymentMethods, DimLocations, and DimDates.</w:t>
       </w:r>
     </w:p>
     <w:p>
       <w:pPr>
-        <w:pStyle w:val="ListBullet"/>
-        <w:spacing w:after="80"/>
+        <w:spacing w:after="120" w:line="276" w:lineRule="auto"/>
       </w:pPr>
       <w:r>
         <w:rPr>
           <w:rFonts w:ascii="Calibri" w:hAnsi="Calibri"/>
           <w:sz w:val="22"/>
         </w:rPr>
-        <w:t>Page 2 — Customer Analytics: Customer spending, ranking, top 10 leaderboard, transaction frequency, age-group breakdown.</w:t>
-      </w:r>
-    </w:p>
-    <w:p>
-      <w:pPr>
-        <w:pStyle w:val="ListBullet"/>
-        <w:spacing w:after="80"/>
-      </w:pPr>
-      <w:r>
-        <w:rPr>
-          <w:rFonts w:ascii="Calibri" w:hAnsi="Calibri"/>
-          <w:sz w:val="22"/>
-        </w:rPr>
-        <w:t>Page 3 — Transaction &amp; Category Analytics: Category revenue, volume, payment-channel analysis, ticket sizes.</w:t>
-      </w:r>
-    </w:p>
-    <w:p>
-      <w:pPr>
-        <w:pStyle w:val="ListBullet"/>
-        <w:spacing w:after="80"/>
-      </w:pPr>
-      <w:r>
-        <w:rPr>
-          <w:rFonts w:ascii="Calibri" w:hAnsi="Calibri"/>
-          <w:sz w:val="22"/>
-        </w:rPr>
-        <w:t>Page 4 — Geographical Analytics: State-wise revenue, city performance, regional distribution.</w:t>
-      </w:r>
-    </w:p>
-    <w:p>
-      <w:pPr>
-        <w:pStyle w:val="ListBullet"/>
-        <w:spacing w:after="80"/>
-      </w:pPr>
-      <w:r>
-        <w:rPr>
-          <w:rFonts w:ascii="Calibri" w:hAnsi="Calibri"/>
-          <w:sz w:val="22"/>
-        </w:rPr>
-        <w:t>Page 5 — Risk &amp; Anomaly Analytics: Fraud cases, fraud exposure amount, high-value transaction outliers, risk logs.</w:t>
+        <w:t>SQL Scripts in 01_Database/: 01_FinancialDB_Create.sql, 02_FinancialDB_Tables.sql, 03_FinancialDB_Insert.sql, 04_FinancialDB_Views.sql, 05_FinancialDB_Queries.sql.</w:t>
       </w:r>
     </w:p>
     <w:p>
@@ -621,7 +875,7 @@
           <w:color w:val="1E3A8A"/>
           <w:sz w:val="30"/>
         </w:rPr>
-        <w:t>8. Tableau (Supplementary BI Asset)</w:t>
+        <w:t>8. Power BI Dashboard Specification &amp; DAX Measures</w:t>
       </w:r>
     </w:p>
     <w:p>
@@ -633,7 +887,72 @@
           <w:rFonts w:ascii="Calibri" w:hAnsi="Calibri"/>
           <w:sz w:val="22"/>
         </w:rPr>
-        <w:t>Tableau Workbook: 04_Tableau/Financial_Analytics.twbx | Documentation: 04_Tableau/tableau_calculations.md</w:t>
+        <w:t>Primary Visualization File: 03_PowerBI/Financial_Analytics.pbix | Interactive HTML: 03_PowerBI/Financial_Analytics_Dashboard.html | DAX Library: 03_PowerBI/dax_measures.dax</w:t>
+      </w:r>
+    </w:p>
+    <w:p>
+      <w:pPr>
+        <w:pStyle w:val="ListBullet"/>
+        <w:spacing w:after="80"/>
+      </w:pPr>
+      <w:r>
+        <w:rPr>
+          <w:rFonts w:ascii="Calibri" w:hAnsi="Calibri"/>
+          <w:sz w:val="22"/>
+        </w:rPr>
+        <w:t>Page 1: Executive Financial Overview</w:t>
+      </w:r>
+    </w:p>
+    <w:p>
+      <w:pPr>
+        <w:pStyle w:val="ListBullet"/>
+        <w:spacing w:after="80"/>
+      </w:pPr>
+      <w:r>
+        <w:rPr>
+          <w:rFonts w:ascii="Calibri" w:hAnsi="Calibri"/>
+          <w:sz w:val="22"/>
+        </w:rPr>
+        <w:t>Page 2: Customer Analytics</w:t>
+      </w:r>
+    </w:p>
+    <w:p>
+      <w:pPr>
+        <w:pStyle w:val="ListBullet"/>
+        <w:spacing w:after="80"/>
+      </w:pPr>
+      <w:r>
+        <w:rPr>
+          <w:rFonts w:ascii="Calibri" w:hAnsi="Calibri"/>
+          <w:sz w:val="22"/>
+        </w:rPr>
+        <w:t>Page 3: Transaction &amp; Category Analytics</w:t>
+      </w:r>
+    </w:p>
+    <w:p>
+      <w:pPr>
+        <w:pStyle w:val="ListBullet"/>
+        <w:spacing w:after="80"/>
+      </w:pPr>
+      <w:r>
+        <w:rPr>
+          <w:rFonts w:ascii="Calibri" w:hAnsi="Calibri"/>
+          <w:sz w:val="22"/>
+        </w:rPr>
+        <w:t>Page 4: Geographical Analytics</w:t>
+      </w:r>
+    </w:p>
+    <w:p>
+      <w:pPr>
+        <w:pStyle w:val="ListBullet"/>
+        <w:spacing w:after="80"/>
+      </w:pPr>
+      <w:r>
+        <w:rPr>
+          <w:rFonts w:ascii="Calibri" w:hAnsi="Calibri"/>
+          <w:sz w:val="22"/>
+        </w:rPr>
+        <w:t>Page 5: Risk &amp; Anomaly Analytics</w:t>
       </w:r>
     </w:p>
     <w:p>
@@ -647,7 +966,7 @@
           <w:color w:val="1E3A8A"/>
           <w:sz w:val="30"/>
         </w:rPr>
-        <w:t>9. Python Program Files</w:t>
+        <w:t>9. Supplementary Tableau Asset</w:t>
       </w:r>
     </w:p>
     <w:p>
@@ -659,7 +978,7 @@
           <w:rFonts w:ascii="Calibri" w:hAnsi="Calibri"/>
           <w:sz w:val="22"/>
         </w:rPr>
-        <w:t>Program Files in 02_Program/: financial_data_cleaning.py, load_financial_data_to_sqlserver.py, validate_financial_data.py, financial_analysis.py, financial_analysis.ipynb.</w:t>
+        <w:t>Tableau Packaged Workbook: 04_Tableau/Financial_Analytics.twbx | Calculations Specification: 04_Tableau/tableau_calculations.md</w:t>
       </w:r>
     </w:p>
     <w:p>
@@ -673,98 +992,31 @@
           <w:color w:val="1E3A8A"/>
           <w:sz w:val="30"/>
         </w:rPr>
-        <w:t>10. Project Results</w:t>
+        <w:t>10. Python ETL &amp; Data Quality Audit</w:t>
       </w:r>
     </w:p>
     <w:p>
       <w:pPr>
-        <w:pStyle w:val="ListBullet"/>
-        <w:spacing w:after="80"/>
+        <w:spacing w:after="120" w:line="276" w:lineRule="auto"/>
       </w:pPr>
       <w:r>
         <w:rPr>
           <w:rFonts w:ascii="Calibri" w:hAnsi="Calibri"/>
           <w:sz w:val="22"/>
         </w:rPr>
-        <w:t>Total Transactions: 25,000</w:t>
+        <w:t>Python Program Files in 02_Program/: financial_data_cleaning.py, load_financial_data_to_sqlserver.py, validate_financial_data.py, financial_analysis.py, financial_analysis.ipynb.</w:t>
       </w:r>
     </w:p>
     <w:p>
       <w:pPr>
-        <w:pStyle w:val="ListBullet"/>
-        <w:spacing w:after="80"/>
+        <w:spacing w:after="120" w:line="276" w:lineRule="auto"/>
       </w:pPr>
       <w:r>
         <w:rPr>
           <w:rFonts w:ascii="Calibri" w:hAnsi="Calibri"/>
           <w:sz w:val="22"/>
         </w:rPr>
-        <w:t>Total Transaction Value: $1,724,423.32</w:t>
-      </w:r>
-    </w:p>
-    <w:p>
-      <w:pPr>
-        <w:pStyle w:val="ListBullet"/>
-        <w:spacing w:after="80"/>
-      </w:pPr>
-      <w:r>
-        <w:rPr>
-          <w:rFonts w:ascii="Calibri" w:hAnsi="Calibri"/>
-          <w:sz w:val="22"/>
-        </w:rPr>
-        <w:t>Average Transaction Value: $68.98</w:t>
-      </w:r>
-    </w:p>
-    <w:p>
-      <w:pPr>
-        <w:pStyle w:val="ListBullet"/>
-        <w:spacing w:after="80"/>
-      </w:pPr>
-      <w:r>
-        <w:rPr>
-          <w:rFonts w:ascii="Calibri" w:hAnsi="Calibri"/>
-          <w:sz w:val="22"/>
-        </w:rPr>
-        <w:t>Active Customers: 909</w:t>
-      </w:r>
-    </w:p>
-    <w:p>
-      <w:pPr>
-        <w:pStyle w:val="ListBullet"/>
-        <w:spacing w:after="80"/>
-      </w:pPr>
-      <w:r>
-        <w:rPr>
-          <w:rFonts w:ascii="Calibri" w:hAnsi="Calibri"/>
-          <w:sz w:val="22"/>
-        </w:rPr>
-        <w:t>Fraud Cases: 83 ($47,788.71 Exposure)</w:t>
-      </w:r>
-    </w:p>
-    <w:p>
-      <w:pPr>
-        <w:pStyle w:val="ListBullet"/>
-        <w:spacing w:after="80"/>
-      </w:pPr>
-      <w:r>
-        <w:rPr>
-          <w:rFonts w:ascii="Calibri" w:hAnsi="Calibri"/>
-          <w:sz w:val="22"/>
-        </w:rPr>
-        <w:t>Top Category: grocery_pos ($262,548.26)</w:t>
-      </w:r>
-    </w:p>
-    <w:p>
-      <w:pPr>
-        <w:pStyle w:val="ListBullet"/>
-        <w:spacing w:after="80"/>
-      </w:pPr>
-      <w:r>
-        <w:rPr>
-          <w:rFonts w:ascii="Calibri" w:hAnsi="Calibri"/>
-          <w:sz w:val="22"/>
-        </w:rPr>
-        <w:t>Top State: Texas (TX) ($125,130.60)</w:t>
+        <w:t>Quality Validation Result: 6/6 Tests Passed (100% Data Integrity). Zero orphan foreign keys, zero nulls in primary transaction attributes.</w:t>
       </w:r>
     </w:p>
     <w:p>
@@ -778,19 +1030,124 @@
           <w:color w:val="1E3A8A"/>
           <w:sz w:val="30"/>
         </w:rPr>
-        <w:t>11. Academic Documentation</w:t>
+        <w:t>11. Faculty Verification Checklist</w:t>
       </w:r>
     </w:p>
     <w:p>
       <w:pPr>
-        <w:spacing w:after="120" w:line="276" w:lineRule="auto"/>
+        <w:pStyle w:val="ListBullet"/>
+        <w:spacing w:after="80"/>
       </w:pPr>
       <w:r>
         <w:rPr>
           <w:rFonts w:ascii="Calibri" w:hAnsi="Calibri"/>
           <w:sz w:val="22"/>
         </w:rPr>
-        <w:t>Contains required academic sections: Aim, Algorithm, Methodology, Dataset Details, Results, and Observations.</w:t>
+        <w:t>Step 1: Inspect Kaggle source dataset.</w:t>
+      </w:r>
+    </w:p>
+    <w:p>
+      <w:pPr>
+        <w:pStyle w:val="ListBullet"/>
+        <w:spacing w:after="80"/>
+      </w:pPr>
+      <w:r>
+        <w:rPr>
+          <w:rFonts w:ascii="Calibri" w:hAnsi="Calibri"/>
+          <w:sz w:val="22"/>
+        </w:rPr>
+        <w:t>Step 2: Inspect Python programs in 02_Program/.</w:t>
+      </w:r>
+    </w:p>
+    <w:p>
+      <w:pPr>
+        <w:pStyle w:val="ListBullet"/>
+        <w:spacing w:after="80"/>
+      </w:pPr>
+      <w:r>
+        <w:rPr>
+          <w:rFonts w:ascii="Calibri" w:hAnsi="Calibri"/>
+          <w:sz w:val="22"/>
+        </w:rPr>
+        <w:t>Step 3: Run SQL scripts in numerical order for FinancialAnalyticsDB.</w:t>
+      </w:r>
+    </w:p>
+    <w:p>
+      <w:pPr>
+        <w:pStyle w:val="ListBullet"/>
+        <w:spacing w:after="80"/>
+      </w:pPr>
+      <w:r>
+        <w:rPr>
+          <w:rFonts w:ascii="Calibri" w:hAnsi="Calibri"/>
+          <w:sz w:val="22"/>
+        </w:rPr>
+        <w:t>Step 4: Execute SELECT COUNT(*) FROM FactTransactions; (Expected: 25,000).</w:t>
+      </w:r>
+    </w:p>
+    <w:p>
+      <w:pPr>
+        <w:pStyle w:val="ListBullet"/>
+        <w:spacing w:after="80"/>
+      </w:pPr>
+      <w:r>
+        <w:rPr>
+          <w:rFonts w:ascii="Calibri" w:hAnsi="Calibri"/>
+          <w:sz w:val="22"/>
+        </w:rPr>
+        <w:t>Step 5: Execute 05_FinancialDB_Queries.sql.</w:t>
+      </w:r>
+    </w:p>
+    <w:p>
+      <w:pPr>
+        <w:pStyle w:val="ListBullet"/>
+        <w:spacing w:after="80"/>
+      </w:pPr>
+      <w:r>
+        <w:rPr>
+          <w:rFonts w:ascii="Calibri" w:hAnsi="Calibri"/>
+          <w:sz w:val="22"/>
+        </w:rPr>
+        <w:t>Step 6: Open Power BI 5-page dashboard in 03_PowerBI/.</w:t>
+      </w:r>
+    </w:p>
+    <w:p>
+      <w:pPr>
+        <w:pStyle w:val="ListBullet"/>
+        <w:spacing w:after="80"/>
+      </w:pPr>
+      <w:r>
+        <w:rPr>
+          <w:rFonts w:ascii="Calibri" w:hAnsi="Calibri"/>
+          <w:sz w:val="22"/>
+        </w:rPr>
+        <w:t>Step 7: Inspect Tableau workbook in 04_Tableau/.</w:t>
+      </w:r>
+    </w:p>
+    <w:p>
+      <w:pPr>
+        <w:pStyle w:val="ListBullet"/>
+        <w:spacing w:after="80"/>
+      </w:pPr>
+      <w:r>
+        <w:rPr>
+          <w:rFonts w:ascii="Calibri" w:hAnsi="Calibri"/>
+          <w:sz w:val="22"/>
+        </w:rPr>
+        <w:t>Step 8: Review Word Report in 05_Documentation/.</w:t>
+      </w:r>
+    </w:p>
+    <w:p>
+      <w:pPr>
+        <w:pStyle w:val="ListBullet"/>
+        <w:spacing w:after="80"/>
+      </w:pPr>
+      <w:r>
+        <w:rPr>
+          <w:rFonts w:ascii="Calibri" w:hAnsi="Calibri"/>
+          <w:sz w:val="22"/>
+        </w:rPr>
+        <w:t>Step 9: Scan QR Code in 07_QR/.</w:t>
       </w:r>
     </w:p>
     <w:p>
@@ -804,7 +1161,7 @@
           <w:color w:val="1E3A8A"/>
           <w:sz w:val="30"/>
         </w:rPr>
-        <w:t>12. Independent QR Code</w:t>
+        <w:t>12. Project QR Verification</w:t>
       </w:r>
     </w:p>
     <w:p>
@@ -816,7 +1173,7 @@
           <w:rFonts w:ascii="Calibri" w:hAnsi="Calibri"/>
           <w:sz w:val="22"/>
         </w:rPr>
-        <w:t>Project 1 QR Code: 07_QR/Financial_Analytics_QR.png (Exclusive to Project 1).</w:t>
+        <w:t>Scan the QR code below for exclusive direct access to Project 1 repository and documentation files:</w:t>
       </w:r>
     </w:p>
     <w:p>
@@ -869,138 +1226,7 @@
           <w:color w:val="1E3A8A"/>
           <w:sz w:val="30"/>
         </w:rPr>
-        <w:t>13. Faculty Verification Checklist</w:t>
-      </w:r>
-    </w:p>
-    <w:p>
-      <w:pPr>
-        <w:pStyle w:val="ListBullet"/>
-        <w:spacing w:after="80"/>
-      </w:pPr>
-      <w:r>
-        <w:rPr>
-          <w:rFonts w:ascii="Calibri" w:hAnsi="Calibri"/>
-          <w:sz w:val="22"/>
-        </w:rPr>
-        <w:t>Step 1: Verify Kaggle source dataset (kartik2112/fraud-detection).</w:t>
-      </w:r>
-    </w:p>
-    <w:p>
-      <w:pPr>
-        <w:pStyle w:val="ListBullet"/>
-        <w:spacing w:after="80"/>
-      </w:pPr>
-      <w:r>
-        <w:rPr>
-          <w:rFonts w:ascii="Calibri" w:hAnsi="Calibri"/>
-          <w:sz w:val="22"/>
-        </w:rPr>
-        <w:t>Step 2: Inspect Python programs in 02_Program/.</w:t>
-      </w:r>
-    </w:p>
-    <w:p>
-      <w:pPr>
-        <w:pStyle w:val="ListBullet"/>
-        <w:spacing w:after="80"/>
-      </w:pPr>
-      <w:r>
-        <w:rPr>
-          <w:rFonts w:ascii="Calibri" w:hAnsi="Calibri"/>
-          <w:sz w:val="22"/>
-        </w:rPr>
-        <w:t>Step 3: Run SQL scripts in SSMS for FinancialAnalyticsDB.</w:t>
-      </w:r>
-    </w:p>
-    <w:p>
-      <w:pPr>
-        <w:pStyle w:val="ListBullet"/>
-        <w:spacing w:after="80"/>
-      </w:pPr>
-      <w:r>
-        <w:rPr>
-          <w:rFonts w:ascii="Calibri" w:hAnsi="Calibri"/>
-          <w:sz w:val="22"/>
-        </w:rPr>
-        <w:t>Step 4: Verify 25,000 record count in FactTransactions.</w:t>
-      </w:r>
-    </w:p>
-    <w:p>
-      <w:pPr>
-        <w:pStyle w:val="ListBullet"/>
-        <w:spacing w:after="80"/>
-      </w:pPr>
-      <w:r>
-        <w:rPr>
-          <w:rFonts w:ascii="Calibri" w:hAnsi="Calibri"/>
-          <w:sz w:val="22"/>
-        </w:rPr>
-        <w:t>Step 5: Execute 05_FinancialDB_Queries.sql.</w:t>
-      </w:r>
-    </w:p>
-    <w:p>
-      <w:pPr>
-        <w:pStyle w:val="ListBullet"/>
-        <w:spacing w:after="80"/>
-      </w:pPr>
-      <w:r>
-        <w:rPr>
-          <w:rFonts w:ascii="Calibri" w:hAnsi="Calibri"/>
-          <w:sz w:val="22"/>
-        </w:rPr>
-        <w:t>Step 6: Open Power BI 5-page report in 03_PowerBI/.</w:t>
-      </w:r>
-    </w:p>
-    <w:p>
-      <w:pPr>
-        <w:pStyle w:val="ListBullet"/>
-        <w:spacing w:after="80"/>
-      </w:pPr>
-      <w:r>
-        <w:rPr>
-          <w:rFonts w:ascii="Calibri" w:hAnsi="Calibri"/>
-          <w:sz w:val="22"/>
-        </w:rPr>
-        <w:t>Step 7: Inspect Tableau workbook in 04_Tableau/.</w:t>
-      </w:r>
-    </w:p>
-    <w:p>
-      <w:pPr>
-        <w:pStyle w:val="ListBullet"/>
-        <w:spacing w:after="80"/>
-      </w:pPr>
-      <w:r>
-        <w:rPr>
-          <w:rFonts w:ascii="Calibri" w:hAnsi="Calibri"/>
-          <w:sz w:val="22"/>
-        </w:rPr>
-        <w:t>Step 8: Review Word Report in 05_Documentation/.</w:t>
-      </w:r>
-    </w:p>
-    <w:p>
-      <w:pPr>
-        <w:pStyle w:val="ListBullet"/>
-        <w:spacing w:after="80"/>
-      </w:pPr>
-      <w:r>
-        <w:rPr>
-          <w:rFonts w:ascii="Calibri" w:hAnsi="Calibri"/>
-          <w:sz w:val="22"/>
-        </w:rPr>
-        <w:t>Step 9: Scan QR code in 07_QR/.</w:t>
-      </w:r>
-    </w:p>
-    <w:p>
-      <w:pPr>
-        <w:spacing w:before="320" w:after="120"/>
-      </w:pPr>
-      <w:r>
-        <w:rPr>
-          <w:rFonts w:ascii="Arial" w:hAnsi="Arial"/>
-          <w:b/>
-          <w:color w:val="1E3A8A"/>
-          <w:sz w:val="30"/>
-        </w:rPr>
-        <w:t>14. Final Project Architecture</w:t>
+        <w:t>13. Submission Statement</w:t>
       </w:r>
     </w:p>
     <w:p>
@@ -1012,33 +1238,7 @@
           <w:rFonts w:ascii="Calibri" w:hAnsi="Calibri"/>
           <w:sz w:val="22"/>
         </w:rPr>
-        <w:t>Kaggle Financial Dataset → Python Cleaning &amp; ETL → Microsoft SQL Server FinancialAnalyticsDB → T-SQL Views &amp; Queries → Power BI (5 Pages) &amp; Tableau → Business Insights → Word Documentation → Project QR Code.</w:t>
-      </w:r>
-    </w:p>
-    <w:p>
-      <w:pPr>
-        <w:spacing w:before="320" w:after="120"/>
-      </w:pPr>
-      <w:r>
-        <w:rPr>
-          <w:rFonts w:ascii="Arial" w:hAnsi="Arial"/>
-          <w:b/>
-          <w:color w:val="1E3A8A"/>
-          <w:sz w:val="30"/>
-        </w:rPr>
-        <w:t>15. Submission Statement</w:t>
-      </w:r>
-    </w:p>
-    <w:p>
-      <w:pPr>
-        <w:spacing w:after="120" w:line="276" w:lineRule="auto"/>
-      </w:pPr>
-      <w:r>
-        <w:rPr>
-          <w:rFonts w:ascii="Calibri" w:hAnsi="Calibri"/>
-          <w:sz w:val="22"/>
-        </w:rPr>
-        <w:t>This project is an independent Financial Data Analytics mini project. It uses approximately 20,000+ financial transaction records, stores and manages the analytical data in Microsoft SQL Server, performs data analysis using Python and T-SQL, and presents business insights through Power BI and Tableau. The project is maintained independently from the second mini project and has its own documentation, program files, database scripts, BI assets, results and QR verification mechanism.</w:t>
+        <w:t>This project is an independent Financial Data Analytics mini project. It uses 25,000 financial transaction records, stores and manages the analytical data in Microsoft SQL Server, performs data analysis using Python and T-SQL, and presents business insights through Power BI and Tableau. The project has its own documentation, program files, database scripts, BI assets, results and QR verification mechanism.</w:t>
       </w:r>
     </w:p>
     <w:sectPr>

</xml_diff>